<commit_message>
redid week 1 capstone
</commit_message>
<xml_diff>
--- a/capstone/Required_Capstone_Checkpoint_1_1_Worksheet.docx
+++ b/capstone/Required_Capstone_Checkpoint_1_1_Worksheet.docx
@@ -1,6 +1,6 @@
 
 <file path=word/document.xml><?xml version="1.0" encoding="utf-8"?>
-<w:document xmlns:wpc="http://schemas.microsoft.com/office/word/2010/wordprocessingCanvas" xmlns:cx="http://schemas.microsoft.com/office/drawing/2014/chartex" xmlns:cx1="http://schemas.microsoft.com/office/drawing/2015/9/8/chartex" xmlns:cx2="http://schemas.microsoft.com/office/drawing/2015/10/21/chartex" xmlns:cx3="http://schemas.microsoft.com/office/drawing/2016/5/9/chartex" xmlns:cx4="http://schemas.microsoft.com/office/drawing/2016/5/10/chartex" xmlns:cx5="http://schemas.microsoft.com/office/drawing/2016/5/11/chartex" xmlns:cx6="http://schemas.microsoft.com/office/drawing/2016/5/12/chartex" xmlns:cx7="http://schemas.microsoft.com/office/drawing/2016/5/13/chartex" xmlns:cx8="http://schemas.microsoft.com/office/drawing/2016/5/14/chartex" xmlns:mc="http://schemas.openxmlformats.org/markup-compatibility/2006" xmlns:aink="http://schemas.microsoft.com/office/drawing/2016/ink" xmlns:am3d="http://schemas.microsoft.com/office/drawing/2017/model3d" xmlns:o="urn:schemas-microsoft-com:office:office" xmlns:oel="http://schemas.microsoft.com/office/2019/extlst" xmlns:r="http://schemas.openxmlformats.org/officeDocument/2006/relationships" xmlns:m="http://schemas.openxmlformats.org/officeDocument/2006/math" xmlns:v="urn:schemas-microsoft-com:vml" xmlns:wp14="http://schemas.microsoft.com/office/word/2010/wordprocessingDrawing" xmlns:wp="http://schemas.openxmlformats.org/drawingml/2006/wordprocessingDrawing" xmlns:w10="urn:schemas-microsoft-com:office:word" xmlns:w="http://schemas.openxmlformats.org/wordprocessingml/2006/main" xmlns:w14="http://schemas.microsoft.com/office/word/2010/wordml" xmlns:w15="http://schemas.microsoft.com/office/word/2012/wordml" xmlns:w16cex="http://schemas.microsoft.com/office/word/2018/wordml/cex" xmlns:w16cid="http://schemas.microsoft.com/office/word/2016/wordml/cid" xmlns:w16="http://schemas.microsoft.com/office/word/2018/wordml" xmlns:w16du="http://schemas.microsoft.com/office/word/2023/wordml/word16du" xmlns:w16sdtdh="http://schemas.microsoft.com/office/word/2020/wordml/sdtdatahash" xmlns:w16sdtfl="http://schemas.microsoft.com/office/word/2024/wordml/sdtformatlock" xmlns:w16se="http://schemas.microsoft.com/office/word/2015/wordml/symex" xmlns:wpg="http://schemas.microsoft.com/office/word/2010/wordprocessingGroup" xmlns:wpi="http://schemas.microsoft.com/office/word/2010/wordprocessingInk" xmlns:wne="http://schemas.microsoft.com/office/word/2006/wordml" xmlns:wps="http://schemas.microsoft.com/office/word/2010/wordprocessingShape" mc:Ignorable="w14 w15 w16se w16cid w16 w16cex w16sdtdh w16sdtfl w16du wp14">
+<w:document xmlns:wpc="http://schemas.microsoft.com/office/word/2010/wordprocessingCanvas" xmlns:cx="http://schemas.microsoft.com/office/drawing/2014/chartex" xmlns:cx1="http://schemas.microsoft.com/office/drawing/2015/9/8/chartex" xmlns:cx2="http://schemas.microsoft.com/office/drawing/2015/10/21/chartex" xmlns:cx3="http://schemas.microsoft.com/office/drawing/2016/5/9/chartex" xmlns:cx4="http://schemas.microsoft.com/office/drawing/2016/5/10/chartex" xmlns:cx5="http://schemas.microsoft.com/office/drawing/2016/5/11/chartex" xmlns:cx6="http://schemas.microsoft.com/office/drawing/2016/5/12/chartex" xmlns:cx7="http://schemas.microsoft.com/office/drawing/2016/5/13/chartex" xmlns:cx8="http://schemas.microsoft.com/office/drawing/2016/5/14/chartex" xmlns:mc="http://schemas.openxmlformats.org/markup-compatibility/2006" xmlns:m="http://schemas.openxmlformats.org/officeDocument/2006/math" xmlns:aink="http://schemas.microsoft.com/office/drawing/2016/ink" xmlns:am3d="http://schemas.microsoft.com/office/drawing/2017/model3d" xmlns:oel="http://schemas.microsoft.com/office/2019/extlst" xmlns:r="http://schemas.openxmlformats.org/officeDocument/2006/relationships" xmlns:wp14="http://schemas.microsoft.com/office/word/2010/wordprocessingDrawing" xmlns:wp="http://schemas.openxmlformats.org/drawingml/2006/wordprocessingDrawing" xmlns:wpg="http://schemas.microsoft.com/office/word/2010/wordprocessingGroup" xmlns:wpi="http://schemas.microsoft.com/office/word/2010/wordprocessingInk" xmlns:wps="http://schemas.microsoft.com/office/word/2010/wordprocessingShape" xmlns:o="urn:schemas-microsoft-com:office:office" xmlns:v="urn:schemas-microsoft-com:vml" xmlns:w10="urn:schemas-microsoft-com:office:word" xmlns:w="http://schemas.openxmlformats.org/wordprocessingml/2006/main" xmlns:w14="http://schemas.microsoft.com/office/word/2010/wordml" xmlns:w15="http://schemas.microsoft.com/office/word/2012/wordml" xmlns:w16cex="http://schemas.microsoft.com/office/word/2018/wordml/cex" xmlns:w16cid="http://schemas.microsoft.com/office/word/2016/wordml/cid" xmlns:w16="http://schemas.microsoft.com/office/word/2018/wordml" xmlns:w16sdtdh="http://schemas.microsoft.com/office/word/2020/wordml/sdtdatahash" xmlns:w16sdtfl="http://schemas.microsoft.com/office/word/2024/wordml/sdtformatlock" xmlns:w16se="http://schemas.microsoft.com/office/word/2015/wordml/symex" xmlns:w16du="http://schemas.microsoft.com/office/word/2023/wordml/word16du" xmlns:wne="http://schemas.microsoft.com/office/word/2006/wordml" mc:Ignorable="w14 w15 w16se w16cid w16 w16cex w16sdtdh w16sdtfl w16du wp14">
   <w:body>
     <w:p>
       <w:pPr>
@@ -244,7 +244,27 @@
           <w:sz w:val="24"/>
           <w:szCs w:val="24"/>
         </w:rPr>
-        <w:t>Reflect on how retrieval quality affects reliability and user trust</w:t>
+        <w:t xml:space="preserve">Reflect on how retrieval quality </w:t>
+      </w:r>
+      <w:proofErr w:type="gramStart"/>
+      <w:r>
+        <w:rPr>
+          <w:rFonts w:eastAsia="Aptos"/>
+          <w:color w:val="000000"/>
+          <w:sz w:val="24"/>
+          <w:szCs w:val="24"/>
+        </w:rPr>
+        <w:t>affects</w:t>
+      </w:r>
+      <w:proofErr w:type="gramEnd"/>
+      <w:r>
+        <w:rPr>
+          <w:rFonts w:eastAsia="Aptos"/>
+          <w:color w:val="000000"/>
+          <w:sz w:val="24"/>
+          <w:szCs w:val="24"/>
+        </w:rPr>
+        <w:t xml:space="preserve"> reliability and user trust</w:t>
       </w:r>
     </w:p>
     <w:p>
@@ -738,7 +758,23 @@
                 <w:sz w:val="24"/>
                 <w:szCs w:val="24"/>
               </w:rPr>
-              <w:t>Cooter Davenport was not a real person — he’s a fictional character from *The Dukes of Hazzard*. So he did not die in real life.</w:t>
+              <w:t xml:space="preserve">Cooter Davenport was not a real person — he’s a fictional character from *The Dukes of Hazzard*. </w:t>
+            </w:r>
+            <w:proofErr w:type="gramStart"/>
+            <w:r>
+              <w:rPr>
+                <w:sz w:val="24"/>
+                <w:szCs w:val="24"/>
+              </w:rPr>
+              <w:t>So</w:t>
+            </w:r>
+            <w:proofErr w:type="gramEnd"/>
+            <w:r>
+              <w:rPr>
+                <w:sz w:val="24"/>
+                <w:szCs w:val="24"/>
+              </w:rPr>
+              <w:t xml:space="preserve"> he did not die in real life.</w:t>
             </w:r>
           </w:p>
           <w:p>
@@ -899,7 +935,23 @@
                 <w:sz w:val="24"/>
                 <w:szCs w:val="24"/>
               </w:rPr>
-              <w:t>If you want, I can help you find the official 2026 NFL Draft results or, if you meant a different year, I can answer that.</w:t>
+              <w:t xml:space="preserve">If you want, I can help you find the official 2026 NFL Draft results or, if you meant a different year, I </w:t>
+            </w:r>
+            <w:proofErr w:type="gramStart"/>
+            <w:r>
+              <w:rPr>
+                <w:sz w:val="24"/>
+                <w:szCs w:val="24"/>
+              </w:rPr>
+              <w:t>can</w:t>
+            </w:r>
+            <w:proofErr w:type="gramEnd"/>
+            <w:r>
+              <w:rPr>
+                <w:sz w:val="24"/>
+                <w:szCs w:val="24"/>
+              </w:rPr>
+              <w:t xml:space="preserve"> answer that.</w:t>
             </w:r>
           </w:p>
         </w:tc>
@@ -1033,55 +1085,38 @@
           <w:p>
             <w:pPr>
               <w:rPr>
-                <w:sz w:val="24"/>
-                <w:szCs w:val="24"/>
-              </w:rPr>
-            </w:pPr>
-            <w:r>
-              <w:rPr>
-                <w:sz w:val="24"/>
-                <w:szCs w:val="24"/>
-              </w:rPr>
+                <w:lang w:eastAsia="en-US"/>
+              </w:rPr>
+            </w:pPr>
+            <w:r>
               <w:lastRenderedPageBreak/>
-              <w:t xml:space="preserve">Both prompts were selected based on current knowledge that the LLM does not have. </w:t>
-            </w:r>
-            <w:r>
-              <w:rPr>
-                <w:sz w:val="24"/>
-                <w:szCs w:val="24"/>
-              </w:rPr>
-              <w:br/>
-              <w:t>They are asking for data that happened after the training date of 06/2024.</w:t>
-            </w:r>
-            <w:r>
-              <w:rPr>
-                <w:sz w:val="24"/>
-                <w:szCs w:val="24"/>
-              </w:rPr>
-              <w:br/>
-            </w:r>
-            <w:r>
-              <w:rPr>
-                <w:sz w:val="24"/>
-                <w:szCs w:val="24"/>
-              </w:rPr>
-              <w:br/>
-              <w:t>Stale information and knowledge gap.</w:t>
-            </w:r>
-            <w:r>
-              <w:rPr>
-                <w:sz w:val="24"/>
-                <w:szCs w:val="24"/>
-              </w:rPr>
-              <w:br/>
-            </w:r>
-            <w:r>
-              <w:rPr>
-                <w:sz w:val="24"/>
-                <w:szCs w:val="24"/>
-              </w:rPr>
-              <w:br/>
-              <w:t>The 2026 NFL draft would be the gap, the death of “Cooter” would be the stale info</w:t>
+              <w:t>The main limitations I noticed were missing information, stale answers, and inconsistent confidence.</w:t>
+            </w:r>
+          </w:p>
+          <w:p>
+            <w:r>
+              <w:t>When I asked, “Who were the 1st 3 players drafted in the NFL in 2026?”, the model responded, “I don’t have reliable access to the 2026 NFL Draft results in my current data, and I don’t want to guess.” This showed a knowledge gap. It was honest about its uncertainty, but it could not answer the question.</w:t>
+            </w:r>
+          </w:p>
+          <w:p>
+            <w:r>
+              <w:t>For “When and for how much did the Brady Bunch house sell?”, the model answered 2018 for $3.5 million. That response missed the later sale recorded in the saved Wikipedia article: September 11, 2023, for $3.2 million. The answer was incomplete and outdated for someone looking for the latest sale. Earlier runs also gave different prices for the 2018 sale, showing inconsistency.</w:t>
+            </w:r>
+          </w:p>
+          <w:p>
+            <w:r>
+              <w:t>When I asked, “When did Cooter Davenport die in real life?”, the model correctly identified the actor as Ben Jones, but claimed, “There isn’t one because he has not died.” The saved Wikipedia article lists his death as August 9, 2026, making the response an example of stale information presented with too much certainty.</w:t>
+            </w:r>
+          </w:p>
+          <w:p>
+            <w:pPr>
+              <w:rPr>
+                <w:sz w:val="24"/>
+                <w:szCs w:val="24"/>
+              </w:rPr>
+            </w:pPr>
+            <w:r>
+              <w:t>Across these examples, the model recognized its limitations for the NFL question but did not apply the same caution to the other answers. That inconsistency makes it difficult to judge reliability from the response alone.</w:t>
             </w:r>
           </w:p>
         </w:tc>
@@ -1222,63 +1257,32 @@
           <w:p>
             <w:pPr>
               <w:rPr>
-                <w:sz w:val="24"/>
-                <w:szCs w:val="24"/>
-              </w:rPr>
-            </w:pPr>
-            <w:r>
-              <w:rPr>
-                <w:sz w:val="24"/>
-                <w:szCs w:val="24"/>
-              </w:rPr>
-              <w:t>It seems to alert me that it can “feed” me more information about data around the questions I have asked. It can point me to a “</w:t>
-            </w:r>
-            <w:r>
-              <w:rPr>
-                <w:sz w:val="24"/>
-                <w:szCs w:val="24"/>
-              </w:rPr>
-              <w:t>reliable source</w:t>
-            </w:r>
-            <w:r>
-              <w:rPr>
-                <w:sz w:val="24"/>
-                <w:szCs w:val="24"/>
-              </w:rPr>
-              <w:t xml:space="preserve">”, or it can tell me more about “the </w:t>
-            </w:r>
-            <w:r>
-              <w:rPr>
-                <w:sz w:val="24"/>
-                <w:szCs w:val="24"/>
-              </w:rPr>
-              <w:t>real-life actor Ben Jones</w:t>
-            </w:r>
-            <w:r>
-              <w:rPr>
-                <w:sz w:val="24"/>
-                <w:szCs w:val="24"/>
-              </w:rPr>
-              <w:t>”</w:t>
-            </w:r>
-          </w:p>
-          <w:p>
-            <w:pPr>
-              <w:spacing w:after="120"/>
-              <w:rPr>
-                <w:sz w:val="24"/>
-                <w:szCs w:val="24"/>
-              </w:rPr>
-            </w:pPr>
-          </w:p>
-          <w:p>
-            <w:pPr>
-              <w:spacing w:after="120"/>
-              <w:rPr>
-                <w:sz w:val="24"/>
-                <w:szCs w:val="24"/>
-              </w:rPr>
-            </w:pPr>
+                <w:lang w:eastAsia="en-US"/>
+              </w:rPr>
+            </w:pPr>
+            <w:r>
+              <w:t xml:space="preserve">One pattern I noticed was that the model handled obvious gaps in recent knowledge more cautiously than familiar topics. For the 2026 NFL Draft question, it admitted that it did not have reliable results and avoided guessing. For the Brady Bunch house and </w:t>
+            </w:r>
+            <w:r>
+              <w:lastRenderedPageBreak/>
+              <w:t>Cooter Davenport questions, it recognized the subjects and gave confident answers, but those answers missed newer information.</w:t>
+            </w:r>
+          </w:p>
+          <w:p>
+            <w:r>
+              <w:t>This suggests that familiarity with a topic can lead the model to rely on older facts without recognizing that they may have changed. Knowing about a previous house sale or identifying the actor who played a character does not mean it knows their latest circumstances.</w:t>
+            </w:r>
+          </w:p>
+          <w:p>
+            <w:pPr>
+              <w:rPr>
+                <w:sz w:val="24"/>
+                <w:szCs w:val="24"/>
+              </w:rPr>
+            </w:pPr>
+            <w:r>
+              <w:t>The explicitly dated NFL prompt produced a more responsible response because the model acknowledged uncertainty, although it still did not answer the question. The other prompts produced answers that sounded more complete but were less dependable. Across these examples, confidence and detail were not reliable indicators of accuracy, especially for information that changes over time.</w:t>
+            </w:r>
           </w:p>
         </w:tc>
       </w:tr>
@@ -1428,7 +1432,23 @@
                 <w:szCs w:val="24"/>
               </w:rPr>
               <w:br/>
-              <w:t>I have added updated Wikipedia pages to my repo to correctly answer my prompt questions.</w:t>
+              <w:t xml:space="preserve">I have added updated Wikipedia pages to my repo to correctly answer </w:t>
+            </w:r>
+            <w:proofErr w:type="spellStart"/>
+            <w:r>
+              <w:rPr>
+                <w:sz w:val="24"/>
+                <w:szCs w:val="24"/>
+              </w:rPr>
+              <w:t>my</w:t>
+            </w:r>
+            <w:proofErr w:type="spellEnd"/>
+            <w:r>
+              <w:rPr>
+                <w:sz w:val="24"/>
+                <w:szCs w:val="24"/>
+              </w:rPr>
+              <w:t xml:space="preserve"> prompt questions.</w:t>
             </w:r>
             <w:r>
               <w:rPr>
@@ -1458,7 +1478,6 @@
                 <w:sz w:val="24"/>
                 <w:szCs w:val="24"/>
               </w:rPr>
-              <w:lastRenderedPageBreak/>
               <w:t>2026 draft picks were:</w:t>
             </w:r>
             <w:r>
@@ -1513,6 +1532,7 @@
         <w:pStyle w:val="Heading1"/>
       </w:pPr>
       <w:r>
+        <w:lastRenderedPageBreak/>
         <w:t xml:space="preserve">6. </w:t>
       </w:r>
       <w:r>
@@ -1650,7 +1670,39 @@
                 <w:sz w:val="24"/>
                 <w:szCs w:val="24"/>
               </w:rPr>
-              <w:t>Updated wikipeia pages and new ones are required to fulfill the users request.</w:t>
+              <w:t xml:space="preserve">Updated </w:t>
+            </w:r>
+            <w:proofErr w:type="spellStart"/>
+            <w:r>
+              <w:rPr>
+                <w:sz w:val="24"/>
+                <w:szCs w:val="24"/>
+              </w:rPr>
+              <w:t>wikipeia</w:t>
+            </w:r>
+            <w:proofErr w:type="spellEnd"/>
+            <w:r>
+              <w:rPr>
+                <w:sz w:val="24"/>
+                <w:szCs w:val="24"/>
+              </w:rPr>
+              <w:t xml:space="preserve"> pages and new ones are required to fulfill the </w:t>
+            </w:r>
+            <w:proofErr w:type="gramStart"/>
+            <w:r>
+              <w:rPr>
+                <w:sz w:val="24"/>
+                <w:szCs w:val="24"/>
+              </w:rPr>
+              <w:t>users</w:t>
+            </w:r>
+            <w:proofErr w:type="gramEnd"/>
+            <w:r>
+              <w:rPr>
+                <w:sz w:val="24"/>
+                <w:szCs w:val="24"/>
+              </w:rPr>
+              <w:t xml:space="preserve"> request.</w:t>
             </w:r>
             <w:r>
               <w:rPr>
@@ -1824,7 +1876,6 @@
         <w:pStyle w:val="Heading1"/>
       </w:pPr>
       <w:r>
-        <w:lastRenderedPageBreak/>
         <w:t>7. Reflection and Next Steps</w:t>
       </w:r>
     </w:p>
@@ -1883,6 +1934,7 @@
                 <w:sz w:val="24"/>
                 <w:szCs w:val="24"/>
               </w:rPr>
+              <w:lastRenderedPageBreak/>
               <w:t>Explanation</w:t>
             </w:r>
           </w:p>
@@ -1905,83 +1957,35 @@
           <w:p>
             <w:pPr>
               <w:rPr>
-                <w:sz w:val="24"/>
-                <w:szCs w:val="24"/>
-              </w:rPr>
-            </w:pPr>
-            <w:r>
-              <w:rPr>
-                <w:sz w:val="24"/>
-                <w:szCs w:val="24"/>
-              </w:rPr>
-              <w:t>When the LLM responds in a factual way with inaccurate data that the user knows for sure, it fosters untrust with the end user.</w:t>
-            </w:r>
-            <w:r>
-              <w:rPr>
-                <w:sz w:val="24"/>
-                <w:szCs w:val="24"/>
-              </w:rPr>
-              <w:br/>
-            </w:r>
-            <w:r>
-              <w:rPr>
-                <w:sz w:val="24"/>
-                <w:szCs w:val="24"/>
-              </w:rPr>
-              <w:br/>
-              <w:t>The more the system responds with data that the user knows to be true, it develops trust.</w:t>
-            </w:r>
-            <w:r>
-              <w:rPr>
-                <w:sz w:val="24"/>
-                <w:szCs w:val="24"/>
-              </w:rPr>
-              <w:br/>
-            </w:r>
-            <w:r>
-              <w:rPr>
-                <w:sz w:val="24"/>
-                <w:szCs w:val="24"/>
-              </w:rPr>
-              <w:br/>
-              <w:t>The more times the system responds in a factual way with bad facts, the more useless it is to the end user.</w:t>
-            </w:r>
-          </w:p>
-          <w:p>
-            <w:pPr>
-              <w:spacing w:after="120"/>
-              <w:rPr>
-                <w:sz w:val="24"/>
-                <w:szCs w:val="24"/>
-              </w:rPr>
-            </w:pPr>
-          </w:p>
-          <w:p>
-            <w:pPr>
-              <w:spacing w:after="120"/>
-              <w:rPr>
-                <w:sz w:val="24"/>
-                <w:szCs w:val="24"/>
-              </w:rPr>
-            </w:pPr>
-          </w:p>
-          <w:p>
-            <w:pPr>
-              <w:spacing w:after="120"/>
-              <w:rPr>
-                <w:sz w:val="24"/>
-                <w:szCs w:val="24"/>
-              </w:rPr>
-            </w:pPr>
-          </w:p>
-          <w:p>
-            <w:pPr>
-              <w:spacing w:after="120"/>
-              <w:rPr>
-                <w:sz w:val="24"/>
-                <w:szCs w:val="24"/>
-              </w:rPr>
-            </w:pPr>
+                <w:lang w:eastAsia="en-US"/>
+              </w:rPr>
+            </w:pPr>
+            <w:r>
+              <w:t xml:space="preserve">Retrieval only helps if the information it finds </w:t>
+            </w:r>
+            <w:proofErr w:type="gramStart"/>
+            <w:r>
+              <w:t>actually supports</w:t>
+            </w:r>
+            <w:proofErr w:type="gramEnd"/>
+            <w:r>
+              <w:t xml:space="preserve"> the answer. Precise, relevant retrieval would provide the first three picks from the 2026 NFL Draft, the details of the most recent Brady Bunch house sale, and an updated article about Ben Jones, the actor who played Cooter Davenport. This would give the model evidence to answer the questions and sources the user could check.</w:t>
+            </w:r>
+          </w:p>
+          <w:p>
+            <w:r>
+              <w:t>Poor retrieval could leave the same problems in place or make them worse. An article about NFL draft predictions might lead the model to present projected picks as actual results. A passage about the house’s 2018 sale could leave out the later transaction. Retrieving information about the fictional character Cooter instead of the actor could produce an answer that misses the question entirely. An older biography could also repeat the outdated claim that Jones was still alive.</w:t>
+            </w:r>
+          </w:p>
+          <w:p>
+            <w:r>
+              <w:t>Incomplete information can produce partial answers, while inaccurate information can produce incorrect answers even when the model follows the source closely. Adding a citation may make those answers look more trustworthy without making them correct.</w:t>
+            </w:r>
+          </w:p>
+          <w:p>
+            <w:r>
+              <w:t>Good retrieval improves output quality by supplying accurate, current evidence that directly addresses the question. It also builds user trust by making answers verifiable. When the retrieved material is insufficient or conflicting, the system should explain that limitation instead of filling in the gaps with guesses.</w:t>
+            </w:r>
           </w:p>
         </w:tc>
       </w:tr>
@@ -2146,6 +2150,13 @@
                 <w:szCs w:val="24"/>
               </w:rPr>
               <w:br/>
+            </w:r>
+            <w:r>
+              <w:rPr>
+                <w:sz w:val="24"/>
+                <w:szCs w:val="24"/>
+              </w:rPr>
+              <w:lastRenderedPageBreak/>
               <w:t xml:space="preserve">For my prompts with known issues, the next course of action is to get that data and add it to the LLMs context. Then </w:t>
             </w:r>
             <w:r>
@@ -2468,14 +2479,7 @@
                 <w:sz w:val="24"/>
                 <w:szCs w:val="24"/>
               </w:rPr>
-              <w:t xml:space="preserve">Wikipedia – </w:t>
-            </w:r>
-            <w:r>
-              <w:rPr>
-                <w:sz w:val="24"/>
-                <w:szCs w:val="24"/>
-              </w:rPr>
-              <w:t>Ben Jones</w:t>
+              <w:t>Wikipedia – Ben Jones</w:t>
             </w:r>
           </w:p>
         </w:tc>
@@ -2676,7 +2680,6 @@
     </w:p>
     <w:p>
       <w:r>
-        <w:lastRenderedPageBreak/>
         <w:t>Return to the assignment page in the learning platform to upload and submit your completed capstone checkpoint and complete any remaining items in this module.</w:t>
       </w:r>
     </w:p>
@@ -2695,7 +2698,7 @@
 </file>
 
 <file path=word/endnotes.xml><?xml version="1.0" encoding="utf-8"?>
-<w:endnotes xmlns:wpc="http://schemas.microsoft.com/office/word/2010/wordprocessingCanvas" xmlns:cx="http://schemas.microsoft.com/office/drawing/2014/chartex" xmlns:cx1="http://schemas.microsoft.com/office/drawing/2015/9/8/chartex" xmlns:cx2="http://schemas.microsoft.com/office/drawing/2015/10/21/chartex" xmlns:cx3="http://schemas.microsoft.com/office/drawing/2016/5/9/chartex" xmlns:cx4="http://schemas.microsoft.com/office/drawing/2016/5/10/chartex" xmlns:cx5="http://schemas.microsoft.com/office/drawing/2016/5/11/chartex" xmlns:cx6="http://schemas.microsoft.com/office/drawing/2016/5/12/chartex" xmlns:cx7="http://schemas.microsoft.com/office/drawing/2016/5/13/chartex" xmlns:cx8="http://schemas.microsoft.com/office/drawing/2016/5/14/chartex" xmlns:mc="http://schemas.openxmlformats.org/markup-compatibility/2006" xmlns:aink="http://schemas.microsoft.com/office/drawing/2016/ink" xmlns:am3d="http://schemas.microsoft.com/office/drawing/2017/model3d" xmlns:o="urn:schemas-microsoft-com:office:office" xmlns:oel="http://schemas.microsoft.com/office/2019/extlst" xmlns:r="http://schemas.openxmlformats.org/officeDocument/2006/relationships" xmlns:m="http://schemas.openxmlformats.org/officeDocument/2006/math" xmlns:v="urn:schemas-microsoft-com:vml" xmlns:wp14="http://schemas.microsoft.com/office/word/2010/wordprocessingDrawing" xmlns:wp="http://schemas.openxmlformats.org/drawingml/2006/wordprocessingDrawing" xmlns:w10="urn:schemas-microsoft-com:office:word" xmlns:w="http://schemas.openxmlformats.org/wordprocessingml/2006/main" xmlns:w14="http://schemas.microsoft.com/office/word/2010/wordml" xmlns:w15="http://schemas.microsoft.com/office/word/2012/wordml" xmlns:w16cex="http://schemas.microsoft.com/office/word/2018/wordml/cex" xmlns:w16cid="http://schemas.microsoft.com/office/word/2016/wordml/cid" xmlns:w16="http://schemas.microsoft.com/office/word/2018/wordml" xmlns:w16du="http://schemas.microsoft.com/office/word/2023/wordml/word16du" xmlns:w16sdtdh="http://schemas.microsoft.com/office/word/2020/wordml/sdtdatahash" xmlns:w16sdtfl="http://schemas.microsoft.com/office/word/2024/wordml/sdtformatlock" xmlns:w16se="http://schemas.microsoft.com/office/word/2015/wordml/symex" xmlns:wpg="http://schemas.microsoft.com/office/word/2010/wordprocessingGroup" xmlns:wpi="http://schemas.microsoft.com/office/word/2010/wordprocessingInk" xmlns:wne="http://schemas.microsoft.com/office/word/2006/wordml" xmlns:wps="http://schemas.microsoft.com/office/word/2010/wordprocessingShape" mc:Ignorable="w14 w15 w16se w16cid w16 w16cex w16sdtdh w16sdtfl w16du wp14">
+<w:endnotes xmlns:wpc="http://schemas.microsoft.com/office/word/2010/wordprocessingCanvas" xmlns:cx="http://schemas.microsoft.com/office/drawing/2014/chartex" xmlns:cx1="http://schemas.microsoft.com/office/drawing/2015/9/8/chartex" xmlns:cx2="http://schemas.microsoft.com/office/drawing/2015/10/21/chartex" xmlns:cx3="http://schemas.microsoft.com/office/drawing/2016/5/9/chartex" xmlns:cx4="http://schemas.microsoft.com/office/drawing/2016/5/10/chartex" xmlns:cx5="http://schemas.microsoft.com/office/drawing/2016/5/11/chartex" xmlns:cx6="http://schemas.microsoft.com/office/drawing/2016/5/12/chartex" xmlns:cx7="http://schemas.microsoft.com/office/drawing/2016/5/13/chartex" xmlns:cx8="http://schemas.microsoft.com/office/drawing/2016/5/14/chartex" xmlns:mc="http://schemas.openxmlformats.org/markup-compatibility/2006" xmlns:m="http://schemas.openxmlformats.org/officeDocument/2006/math" xmlns:aink="http://schemas.microsoft.com/office/drawing/2016/ink" xmlns:am3d="http://schemas.microsoft.com/office/drawing/2017/model3d" xmlns:oel="http://schemas.microsoft.com/office/2019/extlst" xmlns:r="http://schemas.openxmlformats.org/officeDocument/2006/relationships" xmlns:wp14="http://schemas.microsoft.com/office/word/2010/wordprocessingDrawing" xmlns:wp="http://schemas.openxmlformats.org/drawingml/2006/wordprocessingDrawing" xmlns:wpg="http://schemas.microsoft.com/office/word/2010/wordprocessingGroup" xmlns:wpi="http://schemas.microsoft.com/office/word/2010/wordprocessingInk" xmlns:wps="http://schemas.microsoft.com/office/word/2010/wordprocessingShape" xmlns:o="urn:schemas-microsoft-com:office:office" xmlns:v="urn:schemas-microsoft-com:vml" xmlns:w10="urn:schemas-microsoft-com:office:word" xmlns:w="http://schemas.openxmlformats.org/wordprocessingml/2006/main" xmlns:w14="http://schemas.microsoft.com/office/word/2010/wordml" xmlns:w15="http://schemas.microsoft.com/office/word/2012/wordml" xmlns:w16cex="http://schemas.microsoft.com/office/word/2018/wordml/cex" xmlns:w16cid="http://schemas.microsoft.com/office/word/2016/wordml/cid" xmlns:w16="http://schemas.microsoft.com/office/word/2018/wordml" xmlns:w16sdtdh="http://schemas.microsoft.com/office/word/2020/wordml/sdtdatahash" xmlns:w16sdtfl="http://schemas.microsoft.com/office/word/2024/wordml/sdtformatlock" xmlns:w16se="http://schemas.microsoft.com/office/word/2015/wordml/symex" xmlns:w16du="http://schemas.microsoft.com/office/word/2023/wordml/word16du" xmlns:wne="http://schemas.microsoft.com/office/word/2006/wordml" mc:Ignorable="w14 w15 w16se w16cid w16 w16cex w16sdtdh w16sdtfl w16du wp14">
   <w:endnote w:type="separator" w:id="-1">
     <w:p>
       <w:r>
@@ -2714,7 +2717,7 @@
 </file>
 
 <file path=word/footer1.xml><?xml version="1.0" encoding="utf-8"?>
-<w:ftr xmlns:wpc="http://schemas.microsoft.com/office/word/2010/wordprocessingCanvas" xmlns:cx="http://schemas.microsoft.com/office/drawing/2014/chartex" xmlns:cx1="http://schemas.microsoft.com/office/drawing/2015/9/8/chartex" xmlns:cx2="http://schemas.microsoft.com/office/drawing/2015/10/21/chartex" xmlns:cx3="http://schemas.microsoft.com/office/drawing/2016/5/9/chartex" xmlns:cx4="http://schemas.microsoft.com/office/drawing/2016/5/10/chartex" xmlns:cx5="http://schemas.microsoft.com/office/drawing/2016/5/11/chartex" xmlns:cx6="http://schemas.microsoft.com/office/drawing/2016/5/12/chartex" xmlns:cx7="http://schemas.microsoft.com/office/drawing/2016/5/13/chartex" xmlns:cx8="http://schemas.microsoft.com/office/drawing/2016/5/14/chartex" xmlns:mc="http://schemas.openxmlformats.org/markup-compatibility/2006" xmlns:aink="http://schemas.microsoft.com/office/drawing/2016/ink" xmlns:am3d="http://schemas.microsoft.com/office/drawing/2017/model3d" xmlns:o="urn:schemas-microsoft-com:office:office" xmlns:oel="http://schemas.microsoft.com/office/2019/extlst" xmlns:r="http://schemas.openxmlformats.org/officeDocument/2006/relationships" xmlns:m="http://schemas.openxmlformats.org/officeDocument/2006/math" xmlns:v="urn:schemas-microsoft-com:vml" xmlns:wp14="http://schemas.microsoft.com/office/word/2010/wordprocessingDrawing" xmlns:wp="http://schemas.openxmlformats.org/drawingml/2006/wordprocessingDrawing" xmlns:w10="urn:schemas-microsoft-com:office:word" xmlns:w="http://schemas.openxmlformats.org/wordprocessingml/2006/main" xmlns:w14="http://schemas.microsoft.com/office/word/2010/wordml" xmlns:w15="http://schemas.microsoft.com/office/word/2012/wordml" xmlns:w16cex="http://schemas.microsoft.com/office/word/2018/wordml/cex" xmlns:w16cid="http://schemas.microsoft.com/office/word/2016/wordml/cid" xmlns:w16="http://schemas.microsoft.com/office/word/2018/wordml" xmlns:w16du="http://schemas.microsoft.com/office/word/2023/wordml/word16du" xmlns:w16sdtdh="http://schemas.microsoft.com/office/word/2020/wordml/sdtdatahash" xmlns:w16sdtfl="http://schemas.microsoft.com/office/word/2024/wordml/sdtformatlock" xmlns:w16se="http://schemas.microsoft.com/office/word/2015/wordml/symex" xmlns:wpg="http://schemas.microsoft.com/office/word/2010/wordprocessingGroup" xmlns:wpi="http://schemas.microsoft.com/office/word/2010/wordprocessingInk" xmlns:wne="http://schemas.microsoft.com/office/word/2006/wordml" xmlns:wps="http://schemas.microsoft.com/office/word/2010/wordprocessingShape" mc:Ignorable="w14 w15 w16se w16cid w16 w16cex w16sdtdh w16sdtfl w16du wp14">
+<w:ftr xmlns:wpc="http://schemas.microsoft.com/office/word/2010/wordprocessingCanvas" xmlns:cx="http://schemas.microsoft.com/office/drawing/2014/chartex" xmlns:cx1="http://schemas.microsoft.com/office/drawing/2015/9/8/chartex" xmlns:cx2="http://schemas.microsoft.com/office/drawing/2015/10/21/chartex" xmlns:cx3="http://schemas.microsoft.com/office/drawing/2016/5/9/chartex" xmlns:cx4="http://schemas.microsoft.com/office/drawing/2016/5/10/chartex" xmlns:cx5="http://schemas.microsoft.com/office/drawing/2016/5/11/chartex" xmlns:cx6="http://schemas.microsoft.com/office/drawing/2016/5/12/chartex" xmlns:cx7="http://schemas.microsoft.com/office/drawing/2016/5/13/chartex" xmlns:cx8="http://schemas.microsoft.com/office/drawing/2016/5/14/chartex" xmlns:mc="http://schemas.openxmlformats.org/markup-compatibility/2006" xmlns:m="http://schemas.openxmlformats.org/officeDocument/2006/math" xmlns:aink="http://schemas.microsoft.com/office/drawing/2016/ink" xmlns:am3d="http://schemas.microsoft.com/office/drawing/2017/model3d" xmlns:oel="http://schemas.microsoft.com/office/2019/extlst" xmlns:r="http://schemas.openxmlformats.org/officeDocument/2006/relationships" xmlns:wp14="http://schemas.microsoft.com/office/word/2010/wordprocessingDrawing" xmlns:wp="http://schemas.openxmlformats.org/drawingml/2006/wordprocessingDrawing" xmlns:wpg="http://schemas.microsoft.com/office/word/2010/wordprocessingGroup" xmlns:wpi="http://schemas.microsoft.com/office/word/2010/wordprocessingInk" xmlns:wps="http://schemas.microsoft.com/office/word/2010/wordprocessingShape" xmlns:o="urn:schemas-microsoft-com:office:office" xmlns:v="urn:schemas-microsoft-com:vml" xmlns:w10="urn:schemas-microsoft-com:office:word" xmlns:w="http://schemas.openxmlformats.org/wordprocessingml/2006/main" xmlns:w14="http://schemas.microsoft.com/office/word/2010/wordml" xmlns:w15="http://schemas.microsoft.com/office/word/2012/wordml" xmlns:w16cex="http://schemas.microsoft.com/office/word/2018/wordml/cex" xmlns:w16cid="http://schemas.microsoft.com/office/word/2016/wordml/cid" xmlns:w16="http://schemas.microsoft.com/office/word/2018/wordml" xmlns:w16sdtdh="http://schemas.microsoft.com/office/word/2020/wordml/sdtdatahash" xmlns:w16sdtfl="http://schemas.microsoft.com/office/word/2024/wordml/sdtformatlock" xmlns:w16se="http://schemas.microsoft.com/office/word/2015/wordml/symex" xmlns:w16du="http://schemas.microsoft.com/office/word/2023/wordml/word16du" xmlns:wne="http://schemas.microsoft.com/office/word/2006/wordml" mc:Ignorable="w14 w15 w16se w16cid w16 w16cex w16sdtdh w16sdtfl w16du wp14">
   <w:p>
     <w:pPr>
       <w:rPr>
@@ -2729,8 +2732,19 @@
         <w:sz w:val="22"/>
         <w:szCs w:val="22"/>
       </w:rPr>
-      <w:t>© MIT xPRO</w:t>
+      <w:t xml:space="preserve">© MIT </w:t>
     </w:r>
+    <w:proofErr w:type="spellStart"/>
+    <w:r>
+      <w:rPr>
+        <w:rFonts w:ascii="Calibri" w:eastAsia="Calibri" w:hAnsi="Calibri" w:cs="Calibri"/>
+        <w:color w:val="000000"/>
+        <w:sz w:val="22"/>
+        <w:szCs w:val="22"/>
+      </w:rPr>
+      <w:t>xPRO</w:t>
+    </w:r>
+    <w:proofErr w:type="spellEnd"/>
     <w:r>
       <w:rPr>
         <w:rFonts w:ascii="Calibri" w:eastAsia="Calibri" w:hAnsi="Calibri" w:cs="Calibri"/>
@@ -3036,7 +3050,7 @@
 </file>
 
 <file path=word/footnotes.xml><?xml version="1.0" encoding="utf-8"?>
-<w:footnotes xmlns:wpc="http://schemas.microsoft.com/office/word/2010/wordprocessingCanvas" xmlns:cx="http://schemas.microsoft.com/office/drawing/2014/chartex" xmlns:cx1="http://schemas.microsoft.com/office/drawing/2015/9/8/chartex" xmlns:cx2="http://schemas.microsoft.com/office/drawing/2015/10/21/chartex" xmlns:cx3="http://schemas.microsoft.com/office/drawing/2016/5/9/chartex" xmlns:cx4="http://schemas.microsoft.com/office/drawing/2016/5/10/chartex" xmlns:cx5="http://schemas.microsoft.com/office/drawing/2016/5/11/chartex" xmlns:cx6="http://schemas.microsoft.com/office/drawing/2016/5/12/chartex" xmlns:cx7="http://schemas.microsoft.com/office/drawing/2016/5/13/chartex" xmlns:cx8="http://schemas.microsoft.com/office/drawing/2016/5/14/chartex" xmlns:mc="http://schemas.openxmlformats.org/markup-compatibility/2006" xmlns:aink="http://schemas.microsoft.com/office/drawing/2016/ink" xmlns:am3d="http://schemas.microsoft.com/office/drawing/2017/model3d" xmlns:o="urn:schemas-microsoft-com:office:office" xmlns:oel="http://schemas.microsoft.com/office/2019/extlst" xmlns:r="http://schemas.openxmlformats.org/officeDocument/2006/relationships" xmlns:m="http://schemas.openxmlformats.org/officeDocument/2006/math" xmlns:v="urn:schemas-microsoft-com:vml" xmlns:wp14="http://schemas.microsoft.com/office/word/2010/wordprocessingDrawing" xmlns:wp="http://schemas.openxmlformats.org/drawingml/2006/wordprocessingDrawing" xmlns:w10="urn:schemas-microsoft-com:office:word" xmlns:w="http://schemas.openxmlformats.org/wordprocessingml/2006/main" xmlns:w14="http://schemas.microsoft.com/office/word/2010/wordml" xmlns:w15="http://schemas.microsoft.com/office/word/2012/wordml" xmlns:w16cex="http://schemas.microsoft.com/office/word/2018/wordml/cex" xmlns:w16cid="http://schemas.microsoft.com/office/word/2016/wordml/cid" xmlns:w16="http://schemas.microsoft.com/office/word/2018/wordml" xmlns:w16du="http://schemas.microsoft.com/office/word/2023/wordml/word16du" xmlns:w16sdtdh="http://schemas.microsoft.com/office/word/2020/wordml/sdtdatahash" xmlns:w16sdtfl="http://schemas.microsoft.com/office/word/2024/wordml/sdtformatlock" xmlns:w16se="http://schemas.microsoft.com/office/word/2015/wordml/symex" xmlns:wpg="http://schemas.microsoft.com/office/word/2010/wordprocessingGroup" xmlns:wpi="http://schemas.microsoft.com/office/word/2010/wordprocessingInk" xmlns:wne="http://schemas.microsoft.com/office/word/2006/wordml" xmlns:wps="http://schemas.microsoft.com/office/word/2010/wordprocessingShape" mc:Ignorable="w14 w15 w16se w16cid w16 w16cex w16sdtdh w16sdtfl w16du wp14">
+<w:footnotes xmlns:wpc="http://schemas.microsoft.com/office/word/2010/wordprocessingCanvas" xmlns:cx="http://schemas.microsoft.com/office/drawing/2014/chartex" xmlns:cx1="http://schemas.microsoft.com/office/drawing/2015/9/8/chartex" xmlns:cx2="http://schemas.microsoft.com/office/drawing/2015/10/21/chartex" xmlns:cx3="http://schemas.microsoft.com/office/drawing/2016/5/9/chartex" xmlns:cx4="http://schemas.microsoft.com/office/drawing/2016/5/10/chartex" xmlns:cx5="http://schemas.microsoft.com/office/drawing/2016/5/11/chartex" xmlns:cx6="http://schemas.microsoft.com/office/drawing/2016/5/12/chartex" xmlns:cx7="http://schemas.microsoft.com/office/drawing/2016/5/13/chartex" xmlns:cx8="http://schemas.microsoft.com/office/drawing/2016/5/14/chartex" xmlns:mc="http://schemas.openxmlformats.org/markup-compatibility/2006" xmlns:m="http://schemas.openxmlformats.org/officeDocument/2006/math" xmlns:aink="http://schemas.microsoft.com/office/drawing/2016/ink" xmlns:am3d="http://schemas.microsoft.com/office/drawing/2017/model3d" xmlns:oel="http://schemas.microsoft.com/office/2019/extlst" xmlns:r="http://schemas.openxmlformats.org/officeDocument/2006/relationships" xmlns:wp14="http://schemas.microsoft.com/office/word/2010/wordprocessingDrawing" xmlns:wp="http://schemas.openxmlformats.org/drawingml/2006/wordprocessingDrawing" xmlns:wpg="http://schemas.microsoft.com/office/word/2010/wordprocessingGroup" xmlns:wpi="http://schemas.microsoft.com/office/word/2010/wordprocessingInk" xmlns:wps="http://schemas.microsoft.com/office/word/2010/wordprocessingShape" xmlns:o="urn:schemas-microsoft-com:office:office" xmlns:v="urn:schemas-microsoft-com:vml" xmlns:w10="urn:schemas-microsoft-com:office:word" xmlns:w="http://schemas.openxmlformats.org/wordprocessingml/2006/main" xmlns:w14="http://schemas.microsoft.com/office/word/2010/wordml" xmlns:w15="http://schemas.microsoft.com/office/word/2012/wordml" xmlns:w16cex="http://schemas.microsoft.com/office/word/2018/wordml/cex" xmlns:w16cid="http://schemas.microsoft.com/office/word/2016/wordml/cid" xmlns:w16="http://schemas.microsoft.com/office/word/2018/wordml" xmlns:w16sdtdh="http://schemas.microsoft.com/office/word/2020/wordml/sdtdatahash" xmlns:w16sdtfl="http://schemas.microsoft.com/office/word/2024/wordml/sdtformatlock" xmlns:w16se="http://schemas.microsoft.com/office/word/2015/wordml/symex" xmlns:w16du="http://schemas.microsoft.com/office/word/2023/wordml/word16du" xmlns:wne="http://schemas.microsoft.com/office/word/2006/wordml" mc:Ignorable="w14 w15 w16se w16cid w16 w16cex w16sdtdh w16sdtfl w16du wp14">
   <w:footnote w:type="separator" w:id="-1">
     <w:p>
       <w:r>
@@ -3055,7 +3069,7 @@
 </file>
 
 <file path=word/header1.xml><?xml version="1.0" encoding="utf-8"?>
-<w:hdr xmlns:wpc="http://schemas.microsoft.com/office/word/2010/wordprocessingCanvas" xmlns:cx="http://schemas.microsoft.com/office/drawing/2014/chartex" xmlns:cx1="http://schemas.microsoft.com/office/drawing/2015/9/8/chartex" xmlns:cx2="http://schemas.microsoft.com/office/drawing/2015/10/21/chartex" xmlns:cx3="http://schemas.microsoft.com/office/drawing/2016/5/9/chartex" xmlns:cx4="http://schemas.microsoft.com/office/drawing/2016/5/10/chartex" xmlns:cx5="http://schemas.microsoft.com/office/drawing/2016/5/11/chartex" xmlns:cx6="http://schemas.microsoft.com/office/drawing/2016/5/12/chartex" xmlns:cx7="http://schemas.microsoft.com/office/drawing/2016/5/13/chartex" xmlns:cx8="http://schemas.microsoft.com/office/drawing/2016/5/14/chartex" xmlns:mc="http://schemas.openxmlformats.org/markup-compatibility/2006" xmlns:aink="http://schemas.microsoft.com/office/drawing/2016/ink" xmlns:am3d="http://schemas.microsoft.com/office/drawing/2017/model3d" xmlns:o="urn:schemas-microsoft-com:office:office" xmlns:oel="http://schemas.microsoft.com/office/2019/extlst" xmlns:r="http://schemas.openxmlformats.org/officeDocument/2006/relationships" xmlns:m="http://schemas.openxmlformats.org/officeDocument/2006/math" xmlns:v="urn:schemas-microsoft-com:vml" xmlns:wp14="http://schemas.microsoft.com/office/word/2010/wordprocessingDrawing" xmlns:wp="http://schemas.openxmlformats.org/drawingml/2006/wordprocessingDrawing" xmlns:w10="urn:schemas-microsoft-com:office:word" xmlns:w="http://schemas.openxmlformats.org/wordprocessingml/2006/main" xmlns:w14="http://schemas.microsoft.com/office/word/2010/wordml" xmlns:w15="http://schemas.microsoft.com/office/word/2012/wordml" xmlns:w16cex="http://schemas.microsoft.com/office/word/2018/wordml/cex" xmlns:w16cid="http://schemas.microsoft.com/office/word/2016/wordml/cid" xmlns:w16="http://schemas.microsoft.com/office/word/2018/wordml" xmlns:w16du="http://schemas.microsoft.com/office/word/2023/wordml/word16du" xmlns:w16sdtdh="http://schemas.microsoft.com/office/word/2020/wordml/sdtdatahash" xmlns:w16sdtfl="http://schemas.microsoft.com/office/word/2024/wordml/sdtformatlock" xmlns:w16se="http://schemas.microsoft.com/office/word/2015/wordml/symex" xmlns:wpg="http://schemas.microsoft.com/office/word/2010/wordprocessingGroup" xmlns:wpi="http://schemas.microsoft.com/office/word/2010/wordprocessingInk" xmlns:wne="http://schemas.microsoft.com/office/word/2006/wordml" xmlns:wps="http://schemas.microsoft.com/office/word/2010/wordprocessingShape" mc:Ignorable="w14 w15 w16se w16cid w16 w16cex w16sdtdh w16sdtfl w16du wp14">
+<w:hdr xmlns:wpc="http://schemas.microsoft.com/office/word/2010/wordprocessingCanvas" xmlns:cx="http://schemas.microsoft.com/office/drawing/2014/chartex" xmlns:cx1="http://schemas.microsoft.com/office/drawing/2015/9/8/chartex" xmlns:cx2="http://schemas.microsoft.com/office/drawing/2015/10/21/chartex" xmlns:cx3="http://schemas.microsoft.com/office/drawing/2016/5/9/chartex" xmlns:cx4="http://schemas.microsoft.com/office/drawing/2016/5/10/chartex" xmlns:cx5="http://schemas.microsoft.com/office/drawing/2016/5/11/chartex" xmlns:cx6="http://schemas.microsoft.com/office/drawing/2016/5/12/chartex" xmlns:cx7="http://schemas.microsoft.com/office/drawing/2016/5/13/chartex" xmlns:cx8="http://schemas.microsoft.com/office/drawing/2016/5/14/chartex" xmlns:mc="http://schemas.openxmlformats.org/markup-compatibility/2006" xmlns:m="http://schemas.openxmlformats.org/officeDocument/2006/math" xmlns:aink="http://schemas.microsoft.com/office/drawing/2016/ink" xmlns:am3d="http://schemas.microsoft.com/office/drawing/2017/model3d" xmlns:oel="http://schemas.microsoft.com/office/2019/extlst" xmlns:r="http://schemas.openxmlformats.org/officeDocument/2006/relationships" xmlns:wp14="http://schemas.microsoft.com/office/word/2010/wordprocessingDrawing" xmlns:wp="http://schemas.openxmlformats.org/drawingml/2006/wordprocessingDrawing" xmlns:wpg="http://schemas.microsoft.com/office/word/2010/wordprocessingGroup" xmlns:wpi="http://schemas.microsoft.com/office/word/2010/wordprocessingInk" xmlns:wps="http://schemas.microsoft.com/office/word/2010/wordprocessingShape" xmlns:o="urn:schemas-microsoft-com:office:office" xmlns:v="urn:schemas-microsoft-com:vml" xmlns:w10="urn:schemas-microsoft-com:office:word" xmlns:w="http://schemas.openxmlformats.org/wordprocessingml/2006/main" xmlns:w14="http://schemas.microsoft.com/office/word/2010/wordml" xmlns:w15="http://schemas.microsoft.com/office/word/2012/wordml" xmlns:w16cex="http://schemas.microsoft.com/office/word/2018/wordml/cex" xmlns:w16cid="http://schemas.microsoft.com/office/word/2016/wordml/cid" xmlns:w16="http://schemas.microsoft.com/office/word/2018/wordml" xmlns:w16sdtdh="http://schemas.microsoft.com/office/word/2020/wordml/sdtdatahash" xmlns:w16sdtfl="http://schemas.microsoft.com/office/word/2024/wordml/sdtformatlock" xmlns:w16se="http://schemas.microsoft.com/office/word/2015/wordml/symex" xmlns:w16du="http://schemas.microsoft.com/office/word/2023/wordml/word16du" xmlns:wne="http://schemas.microsoft.com/office/word/2006/wordml" mc:Ignorable="w14 w15 w16se w16cid w16 w16cex w16sdtdh w16sdtfl w16du wp14">
   <w:p>
     <w:r>
       <w:rPr>
@@ -3110,7 +3124,7 @@
 </file>
 
 <file path=word/header2.xml><?xml version="1.0" encoding="utf-8"?>
-<w:hdr xmlns:wpc="http://schemas.microsoft.com/office/word/2010/wordprocessingCanvas" xmlns:cx="http://schemas.microsoft.com/office/drawing/2014/chartex" xmlns:cx1="http://schemas.microsoft.com/office/drawing/2015/9/8/chartex" xmlns:cx2="http://schemas.microsoft.com/office/drawing/2015/10/21/chartex" xmlns:cx3="http://schemas.microsoft.com/office/drawing/2016/5/9/chartex" xmlns:cx4="http://schemas.microsoft.com/office/drawing/2016/5/10/chartex" xmlns:cx5="http://schemas.microsoft.com/office/drawing/2016/5/11/chartex" xmlns:cx6="http://schemas.microsoft.com/office/drawing/2016/5/12/chartex" xmlns:cx7="http://schemas.microsoft.com/office/drawing/2016/5/13/chartex" xmlns:cx8="http://schemas.microsoft.com/office/drawing/2016/5/14/chartex" xmlns:mc="http://schemas.openxmlformats.org/markup-compatibility/2006" xmlns:aink="http://schemas.microsoft.com/office/drawing/2016/ink" xmlns:am3d="http://schemas.microsoft.com/office/drawing/2017/model3d" xmlns:o="urn:schemas-microsoft-com:office:office" xmlns:oel="http://schemas.microsoft.com/office/2019/extlst" xmlns:r="http://schemas.openxmlformats.org/officeDocument/2006/relationships" xmlns:m="http://schemas.openxmlformats.org/officeDocument/2006/math" xmlns:v="urn:schemas-microsoft-com:vml" xmlns:wp14="http://schemas.microsoft.com/office/word/2010/wordprocessingDrawing" xmlns:wp="http://schemas.openxmlformats.org/drawingml/2006/wordprocessingDrawing" xmlns:w10="urn:schemas-microsoft-com:office:word" xmlns:w="http://schemas.openxmlformats.org/wordprocessingml/2006/main" xmlns:w14="http://schemas.microsoft.com/office/word/2010/wordml" xmlns:w15="http://schemas.microsoft.com/office/word/2012/wordml" xmlns:w16cex="http://schemas.microsoft.com/office/word/2018/wordml/cex" xmlns:w16cid="http://schemas.microsoft.com/office/word/2016/wordml/cid" xmlns:w16="http://schemas.microsoft.com/office/word/2018/wordml" xmlns:w16du="http://schemas.microsoft.com/office/word/2023/wordml/word16du" xmlns:w16sdtdh="http://schemas.microsoft.com/office/word/2020/wordml/sdtdatahash" xmlns:w16sdtfl="http://schemas.microsoft.com/office/word/2024/wordml/sdtformatlock" xmlns:w16se="http://schemas.microsoft.com/office/word/2015/wordml/symex" xmlns:wpg="http://schemas.microsoft.com/office/word/2010/wordprocessingGroup" xmlns:wpi="http://schemas.microsoft.com/office/word/2010/wordprocessingInk" xmlns:wne="http://schemas.microsoft.com/office/word/2006/wordml" xmlns:wps="http://schemas.microsoft.com/office/word/2010/wordprocessingShape" mc:Ignorable="w14 w15 w16se w16cid w16 w16cex w16sdtdh w16sdtfl w16du wp14">
+<w:hdr xmlns:wpc="http://schemas.microsoft.com/office/word/2010/wordprocessingCanvas" xmlns:cx="http://schemas.microsoft.com/office/drawing/2014/chartex" xmlns:cx1="http://schemas.microsoft.com/office/drawing/2015/9/8/chartex" xmlns:cx2="http://schemas.microsoft.com/office/drawing/2015/10/21/chartex" xmlns:cx3="http://schemas.microsoft.com/office/drawing/2016/5/9/chartex" xmlns:cx4="http://schemas.microsoft.com/office/drawing/2016/5/10/chartex" xmlns:cx5="http://schemas.microsoft.com/office/drawing/2016/5/11/chartex" xmlns:cx6="http://schemas.microsoft.com/office/drawing/2016/5/12/chartex" xmlns:cx7="http://schemas.microsoft.com/office/drawing/2016/5/13/chartex" xmlns:cx8="http://schemas.microsoft.com/office/drawing/2016/5/14/chartex" xmlns:mc="http://schemas.openxmlformats.org/markup-compatibility/2006" xmlns:m="http://schemas.openxmlformats.org/officeDocument/2006/math" xmlns:aink="http://schemas.microsoft.com/office/drawing/2016/ink" xmlns:am3d="http://schemas.microsoft.com/office/drawing/2017/model3d" xmlns:oel="http://schemas.microsoft.com/office/2019/extlst" xmlns:r="http://schemas.openxmlformats.org/officeDocument/2006/relationships" xmlns:wp14="http://schemas.microsoft.com/office/word/2010/wordprocessingDrawing" xmlns:wp="http://schemas.openxmlformats.org/drawingml/2006/wordprocessingDrawing" xmlns:wpg="http://schemas.microsoft.com/office/word/2010/wordprocessingGroup" xmlns:wpi="http://schemas.microsoft.com/office/word/2010/wordprocessingInk" xmlns:wps="http://schemas.microsoft.com/office/word/2010/wordprocessingShape" xmlns:o="urn:schemas-microsoft-com:office:office" xmlns:v="urn:schemas-microsoft-com:vml" xmlns:w10="urn:schemas-microsoft-com:office:word" xmlns:w="http://schemas.openxmlformats.org/wordprocessingml/2006/main" xmlns:w14="http://schemas.microsoft.com/office/word/2010/wordml" xmlns:w15="http://schemas.microsoft.com/office/word/2012/wordml" xmlns:w16cex="http://schemas.microsoft.com/office/word/2018/wordml/cex" xmlns:w16cid="http://schemas.microsoft.com/office/word/2016/wordml/cid" xmlns:w16="http://schemas.microsoft.com/office/word/2018/wordml" xmlns:w16sdtdh="http://schemas.microsoft.com/office/word/2020/wordml/sdtdatahash" xmlns:w16sdtfl="http://schemas.microsoft.com/office/word/2024/wordml/sdtformatlock" xmlns:w16se="http://schemas.microsoft.com/office/word/2015/wordml/symex" xmlns:w16du="http://schemas.microsoft.com/office/word/2023/wordml/word16du" xmlns:wne="http://schemas.microsoft.com/office/word/2006/wordml" mc:Ignorable="w14 w15 w16se w16cid w16 w16cex w16sdtdh w16sdtfl w16du wp14">
   <w:p>
     <w:pPr>
       <w:rPr>
@@ -3342,7 +3356,7 @@
 </file>
 
 <file path=word/header3.xml><?xml version="1.0" encoding="utf-8"?>
-<w:hdr xmlns:wpc="http://schemas.microsoft.com/office/word/2010/wordprocessingCanvas" xmlns:cx="http://schemas.microsoft.com/office/drawing/2014/chartex" xmlns:cx1="http://schemas.microsoft.com/office/drawing/2015/9/8/chartex" xmlns:cx2="http://schemas.microsoft.com/office/drawing/2015/10/21/chartex" xmlns:cx3="http://schemas.microsoft.com/office/drawing/2016/5/9/chartex" xmlns:cx4="http://schemas.microsoft.com/office/drawing/2016/5/10/chartex" xmlns:cx5="http://schemas.microsoft.com/office/drawing/2016/5/11/chartex" xmlns:cx6="http://schemas.microsoft.com/office/drawing/2016/5/12/chartex" xmlns:cx7="http://schemas.microsoft.com/office/drawing/2016/5/13/chartex" xmlns:cx8="http://schemas.microsoft.com/office/drawing/2016/5/14/chartex" xmlns:mc="http://schemas.openxmlformats.org/markup-compatibility/2006" xmlns:aink="http://schemas.microsoft.com/office/drawing/2016/ink" xmlns:am3d="http://schemas.microsoft.com/office/drawing/2017/model3d" xmlns:o="urn:schemas-microsoft-com:office:office" xmlns:oel="http://schemas.microsoft.com/office/2019/extlst" xmlns:r="http://schemas.openxmlformats.org/officeDocument/2006/relationships" xmlns:m="http://schemas.openxmlformats.org/officeDocument/2006/math" xmlns:v="urn:schemas-microsoft-com:vml" xmlns:wp14="http://schemas.microsoft.com/office/word/2010/wordprocessingDrawing" xmlns:wp="http://schemas.openxmlformats.org/drawingml/2006/wordprocessingDrawing" xmlns:w10="urn:schemas-microsoft-com:office:word" xmlns:w="http://schemas.openxmlformats.org/wordprocessingml/2006/main" xmlns:w14="http://schemas.microsoft.com/office/word/2010/wordml" xmlns:w15="http://schemas.microsoft.com/office/word/2012/wordml" xmlns:w16cex="http://schemas.microsoft.com/office/word/2018/wordml/cex" xmlns:w16cid="http://schemas.microsoft.com/office/word/2016/wordml/cid" xmlns:w16="http://schemas.microsoft.com/office/word/2018/wordml" xmlns:w16du="http://schemas.microsoft.com/office/word/2023/wordml/word16du" xmlns:w16sdtdh="http://schemas.microsoft.com/office/word/2020/wordml/sdtdatahash" xmlns:w16sdtfl="http://schemas.microsoft.com/office/word/2024/wordml/sdtformatlock" xmlns:w16se="http://schemas.microsoft.com/office/word/2015/wordml/symex" xmlns:wpg="http://schemas.microsoft.com/office/word/2010/wordprocessingGroup" xmlns:wpi="http://schemas.microsoft.com/office/word/2010/wordprocessingInk" xmlns:wne="http://schemas.microsoft.com/office/word/2006/wordml" xmlns:wps="http://schemas.microsoft.com/office/word/2010/wordprocessingShape" mc:Ignorable="w14 w15 w16se w16cid w16 w16cex w16sdtdh w16sdtfl w16du wp14">
+<w:hdr xmlns:wpc="http://schemas.microsoft.com/office/word/2010/wordprocessingCanvas" xmlns:cx="http://schemas.microsoft.com/office/drawing/2014/chartex" xmlns:cx1="http://schemas.microsoft.com/office/drawing/2015/9/8/chartex" xmlns:cx2="http://schemas.microsoft.com/office/drawing/2015/10/21/chartex" xmlns:cx3="http://schemas.microsoft.com/office/drawing/2016/5/9/chartex" xmlns:cx4="http://schemas.microsoft.com/office/drawing/2016/5/10/chartex" xmlns:cx5="http://schemas.microsoft.com/office/drawing/2016/5/11/chartex" xmlns:cx6="http://schemas.microsoft.com/office/drawing/2016/5/12/chartex" xmlns:cx7="http://schemas.microsoft.com/office/drawing/2016/5/13/chartex" xmlns:cx8="http://schemas.microsoft.com/office/drawing/2016/5/14/chartex" xmlns:mc="http://schemas.openxmlformats.org/markup-compatibility/2006" xmlns:m="http://schemas.openxmlformats.org/officeDocument/2006/math" xmlns:aink="http://schemas.microsoft.com/office/drawing/2016/ink" xmlns:am3d="http://schemas.microsoft.com/office/drawing/2017/model3d" xmlns:oel="http://schemas.microsoft.com/office/2019/extlst" xmlns:r="http://schemas.openxmlformats.org/officeDocument/2006/relationships" xmlns:wp14="http://schemas.microsoft.com/office/word/2010/wordprocessingDrawing" xmlns:wp="http://schemas.openxmlformats.org/drawingml/2006/wordprocessingDrawing" xmlns:wpg="http://schemas.microsoft.com/office/word/2010/wordprocessingGroup" xmlns:wpi="http://schemas.microsoft.com/office/word/2010/wordprocessingInk" xmlns:wps="http://schemas.microsoft.com/office/word/2010/wordprocessingShape" xmlns:o="urn:schemas-microsoft-com:office:office" xmlns:v="urn:schemas-microsoft-com:vml" xmlns:w10="urn:schemas-microsoft-com:office:word" xmlns:w="http://schemas.openxmlformats.org/wordprocessingml/2006/main" xmlns:w14="http://schemas.microsoft.com/office/word/2010/wordml" xmlns:w15="http://schemas.microsoft.com/office/word/2012/wordml" xmlns:w16cex="http://schemas.microsoft.com/office/word/2018/wordml/cex" xmlns:w16cid="http://schemas.microsoft.com/office/word/2016/wordml/cid" xmlns:w16="http://schemas.microsoft.com/office/word/2018/wordml" xmlns:w16sdtdh="http://schemas.microsoft.com/office/word/2020/wordml/sdtdatahash" xmlns:w16sdtfl="http://schemas.microsoft.com/office/word/2024/wordml/sdtformatlock" xmlns:w16se="http://schemas.microsoft.com/office/word/2015/wordml/symex" xmlns:w16du="http://schemas.microsoft.com/office/word/2023/wordml/word16du" xmlns:wne="http://schemas.microsoft.com/office/word/2006/wordml" mc:Ignorable="w14 w15 w16se w16cid w16 w16cex w16sdtdh w16sdtfl w16du wp14">
   <w:p>
     <w:r>
       <w:rPr>
@@ -3397,7 +3411,7 @@
 </file>
 
 <file path=word/numbering.xml><?xml version="1.0" encoding="utf-8"?>
-<w:numbering xmlns:wpc="http://schemas.microsoft.com/office/word/2010/wordprocessingCanvas" xmlns:cx="http://schemas.microsoft.com/office/drawing/2014/chartex" xmlns:cx1="http://schemas.microsoft.com/office/drawing/2015/9/8/chartex" xmlns:cx2="http://schemas.microsoft.com/office/drawing/2015/10/21/chartex" xmlns:cx3="http://schemas.microsoft.com/office/drawing/2016/5/9/chartex" xmlns:cx4="http://schemas.microsoft.com/office/drawing/2016/5/10/chartex" xmlns:cx5="http://schemas.microsoft.com/office/drawing/2016/5/11/chartex" xmlns:cx6="http://schemas.microsoft.com/office/drawing/2016/5/12/chartex" xmlns:cx7="http://schemas.microsoft.com/office/drawing/2016/5/13/chartex" xmlns:cx8="http://schemas.microsoft.com/office/drawing/2016/5/14/chartex" xmlns:mc="http://schemas.openxmlformats.org/markup-compatibility/2006" xmlns:aink="http://schemas.microsoft.com/office/drawing/2016/ink" xmlns:am3d="http://schemas.microsoft.com/office/drawing/2017/model3d" xmlns:o="urn:schemas-microsoft-com:office:office" xmlns:oel="http://schemas.microsoft.com/office/2019/extlst" xmlns:r="http://schemas.openxmlformats.org/officeDocument/2006/relationships" xmlns:m="http://schemas.openxmlformats.org/officeDocument/2006/math" xmlns:v="urn:schemas-microsoft-com:vml" xmlns:wp14="http://schemas.microsoft.com/office/word/2010/wordprocessingDrawing" xmlns:wp="http://schemas.openxmlformats.org/drawingml/2006/wordprocessingDrawing" xmlns:w10="urn:schemas-microsoft-com:office:word" xmlns:w="http://schemas.openxmlformats.org/wordprocessingml/2006/main" xmlns:w14="http://schemas.microsoft.com/office/word/2010/wordml" xmlns:w15="http://schemas.microsoft.com/office/word/2012/wordml" xmlns:w16cex="http://schemas.microsoft.com/office/word/2018/wordml/cex" xmlns:w16cid="http://schemas.microsoft.com/office/word/2016/wordml/cid" xmlns:w16="http://schemas.microsoft.com/office/word/2018/wordml" xmlns:w16du="http://schemas.microsoft.com/office/word/2023/wordml/word16du" xmlns:w16sdtdh="http://schemas.microsoft.com/office/word/2020/wordml/sdtdatahash" xmlns:w16sdtfl="http://schemas.microsoft.com/office/word/2024/wordml/sdtformatlock" xmlns:w16se="http://schemas.microsoft.com/office/word/2015/wordml/symex" xmlns:wpg="http://schemas.microsoft.com/office/word/2010/wordprocessingGroup" xmlns:wpi="http://schemas.microsoft.com/office/word/2010/wordprocessingInk" xmlns:wne="http://schemas.microsoft.com/office/word/2006/wordml" xmlns:wps="http://schemas.microsoft.com/office/word/2010/wordprocessingShape" mc:Ignorable="w14 w15 w16se w16cid w16 w16cex w16sdtdh w16sdtfl w16du wp14">
+<w:numbering xmlns:wpc="http://schemas.microsoft.com/office/word/2010/wordprocessingCanvas" xmlns:cx="http://schemas.microsoft.com/office/drawing/2014/chartex" xmlns:cx1="http://schemas.microsoft.com/office/drawing/2015/9/8/chartex" xmlns:cx2="http://schemas.microsoft.com/office/drawing/2015/10/21/chartex" xmlns:cx3="http://schemas.microsoft.com/office/drawing/2016/5/9/chartex" xmlns:cx4="http://schemas.microsoft.com/office/drawing/2016/5/10/chartex" xmlns:cx5="http://schemas.microsoft.com/office/drawing/2016/5/11/chartex" xmlns:cx6="http://schemas.microsoft.com/office/drawing/2016/5/12/chartex" xmlns:cx7="http://schemas.microsoft.com/office/drawing/2016/5/13/chartex" xmlns:cx8="http://schemas.microsoft.com/office/drawing/2016/5/14/chartex" xmlns:mc="http://schemas.openxmlformats.org/markup-compatibility/2006" xmlns:m="http://schemas.openxmlformats.org/officeDocument/2006/math" xmlns:aink="http://schemas.microsoft.com/office/drawing/2016/ink" xmlns:am3d="http://schemas.microsoft.com/office/drawing/2017/model3d" xmlns:oel="http://schemas.microsoft.com/office/2019/extlst" xmlns:r="http://schemas.openxmlformats.org/officeDocument/2006/relationships" xmlns:wp14="http://schemas.microsoft.com/office/word/2010/wordprocessingDrawing" xmlns:wp="http://schemas.openxmlformats.org/drawingml/2006/wordprocessingDrawing" xmlns:wpg="http://schemas.microsoft.com/office/word/2010/wordprocessingGroup" xmlns:wpi="http://schemas.microsoft.com/office/word/2010/wordprocessingInk" xmlns:wps="http://schemas.microsoft.com/office/word/2010/wordprocessingShape" xmlns:o="urn:schemas-microsoft-com:office:office" xmlns:v="urn:schemas-microsoft-com:vml" xmlns:w10="urn:schemas-microsoft-com:office:word" xmlns:w="http://schemas.openxmlformats.org/wordprocessingml/2006/main" xmlns:w14="http://schemas.microsoft.com/office/word/2010/wordml" xmlns:w15="http://schemas.microsoft.com/office/word/2012/wordml" xmlns:w16cex="http://schemas.microsoft.com/office/word/2018/wordml/cex" xmlns:w16cid="http://schemas.microsoft.com/office/word/2016/wordml/cid" xmlns:w16="http://schemas.microsoft.com/office/word/2018/wordml" xmlns:w16sdtdh="http://schemas.microsoft.com/office/word/2020/wordml/sdtdatahash" xmlns:w16sdtfl="http://schemas.microsoft.com/office/word/2024/wordml/sdtformatlock" xmlns:w16se="http://schemas.microsoft.com/office/word/2015/wordml/symex" xmlns:w16du="http://schemas.microsoft.com/office/word/2023/wordml/word16du" xmlns:wne="http://schemas.microsoft.com/office/word/2006/wordml" mc:Ignorable="w14 w15 w16se w16cid w16 w16cex w16sdtdh w16sdtfl w16du wp14">
   <w:abstractNum w:abstractNumId="0" w15:restartNumberingAfterBreak="0">
     <w:nsid w:val="19DA76D6"/>
     <w:multiLevelType w:val="hybridMultilevel"/>
@@ -4250,7 +4264,7 @@
 </file>
 
 <file path=word/styles.xml><?xml version="1.0" encoding="utf-8"?>
-<w:styles xmlns:mc="http://schemas.openxmlformats.org/markup-compatibility/2006" xmlns:r="http://schemas.openxmlformats.org/officeDocument/2006/relationships" xmlns:w="http://schemas.openxmlformats.org/wordprocessingml/2006/main" xmlns:w14="http://schemas.microsoft.com/office/word/2010/wordml" xmlns:w15="http://schemas.microsoft.com/office/word/2012/wordml" xmlns:w16cex="http://schemas.microsoft.com/office/word/2018/wordml/cex" xmlns:w16cid="http://schemas.microsoft.com/office/word/2016/wordml/cid" xmlns:w16="http://schemas.microsoft.com/office/word/2018/wordml" xmlns:w16du="http://schemas.microsoft.com/office/word/2023/wordml/word16du" xmlns:w16sdtdh="http://schemas.microsoft.com/office/word/2020/wordml/sdtdatahash" xmlns:w16sdtfl="http://schemas.microsoft.com/office/word/2024/wordml/sdtformatlock" xmlns:w16se="http://schemas.microsoft.com/office/word/2015/wordml/symex" mc:Ignorable="w14 w15 w16se w16cid w16 w16cex w16sdtdh w16sdtfl w16du">
+<w:styles xmlns:mc="http://schemas.openxmlformats.org/markup-compatibility/2006" xmlns:r="http://schemas.openxmlformats.org/officeDocument/2006/relationships" xmlns:w="http://schemas.openxmlformats.org/wordprocessingml/2006/main" xmlns:w14="http://schemas.microsoft.com/office/word/2010/wordml" xmlns:w15="http://schemas.microsoft.com/office/word/2012/wordml" xmlns:w16cex="http://schemas.microsoft.com/office/word/2018/wordml/cex" xmlns:w16cid="http://schemas.microsoft.com/office/word/2016/wordml/cid" xmlns:w16="http://schemas.microsoft.com/office/word/2018/wordml" xmlns:w16sdtdh="http://schemas.microsoft.com/office/word/2020/wordml/sdtdatahash" xmlns:w16sdtfl="http://schemas.microsoft.com/office/word/2024/wordml/sdtformatlock" xmlns:w16se="http://schemas.microsoft.com/office/word/2015/wordml/symex" xmlns:w16du="http://schemas.microsoft.com/office/word/2023/wordml/word16du" mc:Ignorable="w14 w15 w16se w16cid w16 w16cex w16sdtdh w16sdtfl w16du">
   <w:docDefaults>
     <w:rPrDefault>
       <w:rPr>
@@ -4959,6 +4973,33 @@
       <w:contextualSpacing/>
     </w:pPr>
   </w:style>
+  <w:style w:type="paragraph" w:styleId="NormalWeb">
+    <w:name w:val="Normal (Web)"/>
+    <w:basedOn w:val="Normal"/>
+    <w:uiPriority w:val="99"/>
+    <w:unhideWhenUsed/>
+    <w:rsid w:val="00683EA8"/>
+    <w:pPr>
+      <w:spacing w:before="100" w:beforeAutospacing="1" w:after="100" w:afterAutospacing="1" w:line="240" w:lineRule="auto"/>
+    </w:pPr>
+    <w:rPr>
+      <w:rFonts w:ascii="Times New Roman" w:hAnsi="Times New Roman" w:cs="Times New Roman"/>
+      <w:sz w:val="24"/>
+      <w:szCs w:val="24"/>
+      <w:lang w:eastAsia="en-US"/>
+    </w:rPr>
+  </w:style>
+  <w:style w:type="character" w:styleId="Strong">
+    <w:name w:val="Strong"/>
+    <w:basedOn w:val="DefaultParagraphFont"/>
+    <w:uiPriority w:val="22"/>
+    <w:qFormat/>
+    <w:rsid w:val="00683EA8"/>
+    <w:rPr>
+      <w:b/>
+      <w:bCs/>
+    </w:rPr>
+  </w:style>
 </w:styles>
 </file>
 

</xml_diff>